<commit_message>
workbuddy phase-8.0a: update Word report with release lock and carry-forward sections
</commit_message>
<xml_diff>
--- a/docs/self-checks/Phase_8.0A_Foundation_Correction_自检报告.docx
+++ b/docs/self-checks/Phase_8.0A_Foundation_Correction_自检报告.docx
@@ -13,7 +13,7 @@
     </w:p>
     <w:p>
       <w:r>
-        <w:t>生成日期：2026-06-27 07:56</w:t>
+        <w:t>生成日期：2026-06-27 10:28</w:t>
       </w:r>
     </w:p>
     <w:p>
@@ -4391,7 +4391,7 @@
               <w:rPr>
                 <w:sz w:val="18"/>
               </w:rPr>
-              <w:t>是否已移除"AI 决策看板"</w:t>
+              <w:t>Release Lock 是否完成</w:t>
             </w:r>
           </w:p>
         </w:tc>
@@ -4420,7 +4420,7 @@
               <w:rPr>
                 <w:sz w:val="18"/>
               </w:rPr>
-              <w:t>/dashboard 导航名称是否改为"招聘总览"</w:t>
+              <w:t>git status 是否 clean</w:t>
             </w:r>
           </w:p>
         </w:tc>
@@ -4449,7 +4449,7 @@
               <w:rPr>
                 <w:sz w:val="18"/>
               </w:rPr>
-              <w:t>/dashboard 页面标题是否改为"AI 招聘洞察看板"</w:t>
+              <w:t>是否已提交 correction commit</w:t>
             </w:r>
           </w:p>
         </w:tc>
@@ -4462,7 +4462,7 @@
               <w:rPr>
                 <w:sz w:val="18"/>
               </w:rPr>
-              <w:t>是</w:t>
+              <w:t>是（1acdb2b）</w:t>
             </w:r>
           </w:p>
         </w:tc>
@@ -4478,7 +4478,7 @@
               <w:rPr>
                 <w:sz w:val="18"/>
               </w:rPr>
-              <w:t>是否已移除"自主智能"</w:t>
+              <w:t>是否已移除"AI 决策看板"</w:t>
             </w:r>
           </w:p>
         </w:tc>
@@ -4507,7 +4507,7 @@
               <w:rPr>
                 <w:sz w:val="18"/>
               </w:rPr>
-              <w:t>Layer 3 是否改为"人工确认后的执行闭环"</w:t>
+              <w:t>是否已移除"AI 决策"主文案</w:t>
             </w:r>
           </w:p>
         </w:tc>
@@ -4536,7 +4536,7 @@
               <w:rPr>
                 <w:sz w:val="18"/>
               </w:rPr>
-              <w:t>四态真实截图是否完成</w:t>
+              <w:t>/dashboard 导航名称是否改为"招聘总览"</w:t>
             </w:r>
           </w:p>
         </w:tc>
@@ -4550,7 +4550,7 @@
               <w:rPr>
                 <w:sz w:val="18"/>
               </w:rPr>
-              <w:t>是（4 张）</w:t>
+              <w:t>是</w:t>
             </w:r>
           </w:p>
         </w:tc>
@@ -4565,7 +4565,7 @@
               <w:rPr>
                 <w:sz w:val="18"/>
               </w:rPr>
-              <w:t>知识库 / 模板库范围是否明确</w:t>
+              <w:t>/dashboard 页面标题是否改为"AI 招聘洞察看板"</w:t>
             </w:r>
           </w:p>
         </w:tc>
@@ -4594,7 +4594,7 @@
               <w:rPr>
                 <w:sz w:val="18"/>
               </w:rPr>
-              <w:t>真实产物抽检是否完成</w:t>
+              <w:t>是否已移除"自主智能"</w:t>
             </w:r>
           </w:p>
         </w:tc>
@@ -4608,7 +4608,7 @@
               <w:rPr>
                 <w:sz w:val="18"/>
               </w:rPr>
-              <w:t>是（10/10）</w:t>
+              <w:t>是</w:t>
             </w:r>
           </w:p>
         </w:tc>
@@ -4623,7 +4623,7 @@
               <w:rPr>
                 <w:sz w:val="18"/>
               </w:rPr>
-              <w:t>是否破坏 Action Center</w:t>
+              <w:t>Layer 3 是否改为"人工确认后的执行闭环"</w:t>
             </w:r>
           </w:p>
         </w:tc>
@@ -4636,7 +4636,7 @@
               <w:rPr>
                 <w:sz w:val="18"/>
               </w:rPr>
-              <w:t>否</w:t>
+              <w:t>是</w:t>
             </w:r>
           </w:p>
         </w:tc>
@@ -4652,7 +4652,7 @@
               <w:rPr>
                 <w:sz w:val="18"/>
               </w:rPr>
-              <w:t>是否进入 Phase 8.1</w:t>
+              <w:t>四态真实截图是否完成</w:t>
             </w:r>
           </w:p>
         </w:tc>
@@ -4666,7 +4666,7 @@
               <w:rPr>
                 <w:sz w:val="18"/>
               </w:rPr>
-              <w:t>否</w:t>
+              <w:t>是（4 张）</w:t>
             </w:r>
           </w:p>
         </w:tc>
@@ -4681,7 +4681,7 @@
               <w:rPr>
                 <w:sz w:val="18"/>
               </w:rPr>
-              <w:t>是否使用 mock 数据</w:t>
+              <w:t>知识库 / 模板库正向价值是否补充</w:t>
             </w:r>
           </w:p>
         </w:tc>
@@ -4694,7 +4694,7 @@
               <w:rPr>
                 <w:sz w:val="18"/>
               </w:rPr>
-              <w:t>否</w:t>
+              <w:t>是（3 文档更新）</w:t>
             </w:r>
           </w:p>
         </w:tc>
@@ -4710,7 +4710,7 @@
               <w:rPr>
                 <w:sz w:val="18"/>
               </w:rPr>
-              <w:t>是否存在假 AI</w:t>
+              <w:t>知识库 / 模板库范围是否明确</w:t>
             </w:r>
           </w:p>
         </w:tc>
@@ -4724,7 +4724,7 @@
               <w:rPr>
                 <w:sz w:val="18"/>
               </w:rPr>
-              <w:t>否</w:t>
+              <w:t>是</w:t>
             </w:r>
           </w:p>
         </w:tc>
@@ -4739,7 +4739,7 @@
               <w:rPr>
                 <w:sz w:val="18"/>
               </w:rPr>
-              <w:t>typecheck/lint/build 是否通过</w:t>
+              <w:t>AI Provenance 真渲染是否已列入 Phase 8.1 验收清单</w:t>
             </w:r>
           </w:p>
         </w:tc>
@@ -4752,7 +4752,7 @@
               <w:rPr>
                 <w:sz w:val="18"/>
               </w:rPr>
-              <w:t>是</w:t>
+              <w:t>是（Carry-forward 已记录）</w:t>
             </w:r>
           </w:p>
         </w:tc>
@@ -4768,7 +4768,7 @@
               <w:rPr>
                 <w:sz w:val="18"/>
               </w:rPr>
-              <w:t>截图是否完成</w:t>
+              <w:t>真实产物抽检是否完成</w:t>
             </w:r>
           </w:p>
         </w:tc>
@@ -4782,7 +4782,7 @@
               <w:rPr>
                 <w:sz w:val="18"/>
               </w:rPr>
-              <w:t>是（4 张）</w:t>
+              <w:t>是（10/10）</w:t>
             </w:r>
           </w:p>
         </w:tc>
@@ -4797,7 +4797,7 @@
               <w:rPr>
                 <w:sz w:val="18"/>
               </w:rPr>
-              <w:t>git status 是否 clean</w:t>
+              <w:t>是否破坏 Action Center</w:t>
             </w:r>
           </w:p>
         </w:tc>
@@ -4810,7 +4810,7 @@
               <w:rPr>
                 <w:sz w:val="18"/>
               </w:rPr>
-              <w:t>待提交</w:t>
+              <w:t>否</w:t>
             </w:r>
           </w:p>
         </w:tc>
@@ -4826,7 +4826,7 @@
               <w:rPr>
                 <w:sz w:val="18"/>
               </w:rPr>
-              <w:t>是否合并 main</w:t>
+              <w:t>是否进入 Phase 8.1</w:t>
             </w:r>
           </w:p>
         </w:tc>
@@ -4855,7 +4855,7 @@
               <w:rPr>
                 <w:sz w:val="18"/>
               </w:rPr>
-              <w:t>是否 force push</w:t>
+              <w:t>是否使用 mock 数据</w:t>
             </w:r>
           </w:p>
         </w:tc>
@@ -4884,7 +4884,7 @@
               <w:rPr>
                 <w:sz w:val="18"/>
               </w:rPr>
-              <w:t>当前风险</w:t>
+              <w:t>是否存在假 AI</w:t>
             </w:r>
           </w:p>
         </w:tc>
@@ -4898,7 +4898,7 @@
               <w:rPr>
                 <w:sz w:val="18"/>
               </w:rPr>
-              <w:t>无</w:t>
+              <w:t>否</w:t>
             </w:r>
           </w:p>
         </w:tc>
@@ -4913,6 +4913,151 @@
               <w:rPr>
                 <w:sz w:val="18"/>
               </w:rPr>
+              <w:t>typecheck/lint/build 是否通过</w:t>
+            </w:r>
+          </w:p>
+        </w:tc>
+        <w:tc>
+          <w:tcPr>
+            <w:tcW w:type="dxa" w:w="4320"/>
+          </w:tcPr>
+          <w:p>
+            <w:r>
+              <w:rPr>
+                <w:sz w:val="18"/>
+              </w:rPr>
+              <w:t>是</w:t>
+            </w:r>
+          </w:p>
+        </w:tc>
+      </w:tr>
+      <w:tr>
+        <w:tc>
+          <w:tcPr>
+            <w:tcW w:type="dxa" w:w="4320"/>
+            <w:shd w:val="clear" w:color="auto" w:fill="F2F6FC"/>
+          </w:tcPr>
+          <w:p>
+            <w:r>
+              <w:rPr>
+                <w:sz w:val="18"/>
+              </w:rPr>
+              <w:t>截图是否完成</w:t>
+            </w:r>
+          </w:p>
+        </w:tc>
+        <w:tc>
+          <w:tcPr>
+            <w:tcW w:type="dxa" w:w="4320"/>
+            <w:shd w:val="clear" w:color="auto" w:fill="F2F6FC"/>
+          </w:tcPr>
+          <w:p>
+            <w:r>
+              <w:rPr>
+                <w:sz w:val="18"/>
+              </w:rPr>
+              <w:t>是（4 张）</w:t>
+            </w:r>
+          </w:p>
+        </w:tc>
+      </w:tr>
+      <w:tr>
+        <w:tc>
+          <w:tcPr>
+            <w:tcW w:type="dxa" w:w="4320"/>
+          </w:tcPr>
+          <w:p>
+            <w:r>
+              <w:rPr>
+                <w:sz w:val="18"/>
+              </w:rPr>
+              <w:t>是否合并 main</w:t>
+            </w:r>
+          </w:p>
+        </w:tc>
+        <w:tc>
+          <w:tcPr>
+            <w:tcW w:type="dxa" w:w="4320"/>
+          </w:tcPr>
+          <w:p>
+            <w:r>
+              <w:rPr>
+                <w:sz w:val="18"/>
+              </w:rPr>
+              <w:t>否</w:t>
+            </w:r>
+          </w:p>
+        </w:tc>
+      </w:tr>
+      <w:tr>
+        <w:tc>
+          <w:tcPr>
+            <w:tcW w:type="dxa" w:w="4320"/>
+            <w:shd w:val="clear" w:color="auto" w:fill="F2F6FC"/>
+          </w:tcPr>
+          <w:p>
+            <w:r>
+              <w:rPr>
+                <w:sz w:val="18"/>
+              </w:rPr>
+              <w:t>是否 force push</w:t>
+            </w:r>
+          </w:p>
+        </w:tc>
+        <w:tc>
+          <w:tcPr>
+            <w:tcW w:type="dxa" w:w="4320"/>
+            <w:shd w:val="clear" w:color="auto" w:fill="F2F6FC"/>
+          </w:tcPr>
+          <w:p>
+            <w:r>
+              <w:rPr>
+                <w:sz w:val="18"/>
+              </w:rPr>
+              <w:t>否</w:t>
+            </w:r>
+          </w:p>
+        </w:tc>
+      </w:tr>
+      <w:tr>
+        <w:tc>
+          <w:tcPr>
+            <w:tcW w:type="dxa" w:w="4320"/>
+          </w:tcPr>
+          <w:p>
+            <w:r>
+              <w:rPr>
+                <w:sz w:val="18"/>
+              </w:rPr>
+              <w:t>当前风险</w:t>
+            </w:r>
+          </w:p>
+        </w:tc>
+        <w:tc>
+          <w:tcPr>
+            <w:tcW w:type="dxa" w:w="4320"/>
+          </w:tcPr>
+          <w:p>
+            <w:r>
+              <w:rPr>
+                <w:sz w:val="18"/>
+              </w:rPr>
+              <w:t>无</w:t>
+            </w:r>
+          </w:p>
+        </w:tc>
+      </w:tr>
+      <w:tr>
+        <w:tc>
+          <w:tcPr>
+            <w:tcW w:type="dxa" w:w="4320"/>
+            <w:shd w:val="clear" w:color="auto" w:fill="F2F6FC"/>
+          </w:tcPr>
+          <w:p>
+            <w:r>
+              <w:rPr>
+                <w:sz w:val="18"/>
+              </w:rPr>
               <w:t>需要外部确认</w:t>
             </w:r>
           </w:p>
@@ -4920,6 +5065,7 @@
         <w:tc>
           <w:tcPr>
             <w:tcW w:type="dxa" w:w="4320"/>
+            <w:shd w:val="clear" w:color="auto" w:fill="F2F6FC"/>
           </w:tcPr>
           <w:p>
             <w:r>
@@ -4927,6 +5073,219 @@
                 <w:sz w:val="18"/>
               </w:rPr>
               <w:t>ChatGPT 最终验收</w:t>
+            </w:r>
+          </w:p>
+        </w:tc>
+      </w:tr>
+    </w:tbl>
+    <w:p/>
+    <w:p>
+      <w:pPr>
+        <w:pStyle w:val="Heading1"/>
+      </w:pPr>
+      <w:r>
+        <w:t>十一、Carry-forward 记录</w:t>
+      </w:r>
+    </w:p>
+    <w:tbl>
+      <w:tblPr>
+        <w:tblStyle w:val="TableGrid"/>
+        <w:tblW w:type="auto" w:w="0"/>
+        <w:jc w:val="center"/>
+        <w:tblLook w:firstColumn="1" w:firstRow="1" w:lastColumn="0" w:lastRow="0" w:noHBand="0" w:noVBand="1" w:val="04A0"/>
+      </w:tblPr>
+      <w:tblGrid>
+        <w:gridCol w:w="2160"/>
+        <w:gridCol w:w="2160"/>
+        <w:gridCol w:w="2160"/>
+        <w:gridCol w:w="2160"/>
+      </w:tblGrid>
+      <w:tr>
+        <w:tc>
+          <w:tcPr>
+            <w:tcW w:type="dxa" w:w="2160"/>
+            <w:shd w:val="clear" w:color="auto" w:fill="2B579A"/>
+          </w:tcPr>
+          <w:p>
+            <w:pPr>
+              <w:jc w:val="center"/>
+            </w:pPr>
+            <w:r>
+              <w:rPr>
+                <w:b/>
+                <w:color w:val="FFFFFF"/>
+                <w:sz w:val="20"/>
+              </w:rPr>
+              <w:t>#</w:t>
+            </w:r>
+          </w:p>
+        </w:tc>
+        <w:tc>
+          <w:tcPr>
+            <w:tcW w:type="dxa" w:w="2160"/>
+            <w:shd w:val="clear" w:color="auto" w:fill="2B579A"/>
+          </w:tcPr>
+          <w:p>
+            <w:pPr>
+              <w:jc w:val="center"/>
+            </w:pPr>
+            <w:r>
+              <w:rPr>
+                <w:b/>
+                <w:color w:val="FFFFFF"/>
+                <w:sz w:val="20"/>
+              </w:rPr>
+              <w:t>内容</w:t>
+            </w:r>
+          </w:p>
+        </w:tc>
+        <w:tc>
+          <w:tcPr>
+            <w:tcW w:type="dxa" w:w="2160"/>
+            <w:shd w:val="clear" w:color="auto" w:fill="2B579A"/>
+          </w:tcPr>
+          <w:p>
+            <w:pPr>
+              <w:jc w:val="center"/>
+            </w:pPr>
+            <w:r>
+              <w:rPr>
+                <w:b/>
+                <w:color w:val="FFFFFF"/>
+                <w:sz w:val="20"/>
+              </w:rPr>
+              <w:t>状态</w:t>
+            </w:r>
+          </w:p>
+        </w:tc>
+        <w:tc>
+          <w:tcPr>
+            <w:tcW w:type="dxa" w:w="2160"/>
+            <w:shd w:val="clear" w:color="auto" w:fill="2B579A"/>
+          </w:tcPr>
+          <w:p>
+            <w:pPr>
+              <w:jc w:val="center"/>
+            </w:pPr>
+            <w:r>
+              <w:rPr>
+                <w:b/>
+                <w:color w:val="FFFFFF"/>
+                <w:sz w:val="20"/>
+              </w:rPr>
+              <w:t>验收阶段</w:t>
+            </w:r>
+          </w:p>
+        </w:tc>
+      </w:tr>
+      <w:tr>
+        <w:tc>
+          <w:tcPr>
+            <w:tcW w:type="dxa" w:w="2160"/>
+            <w:shd w:val="clear" w:color="auto" w:fill="F2F6FC"/>
+          </w:tcPr>
+          <w:p>
+            <w:r>
+              <w:rPr>
+                <w:sz w:val="18"/>
+              </w:rPr>
+              <w:t>CF-1</w:t>
+            </w:r>
+          </w:p>
+        </w:tc>
+        <w:tc>
+          <w:tcPr>
+            <w:tcW w:type="dxa" w:w="2160"/>
+            <w:shd w:val="clear" w:color="auto" w:fill="F2F6FC"/>
+          </w:tcPr>
+          <w:p>
+            <w:r>
+              <w:rPr>
+                <w:sz w:val="18"/>
+              </w:rPr>
+              <w:t>AI Provenance 真渲染核验（provider/model/promptVersion/confidence/evidence/humanReviewStatus）</w:t>
+            </w:r>
+          </w:p>
+        </w:tc>
+        <w:tc>
+          <w:tcPr>
+            <w:tcW w:type="dxa" w:w="2160"/>
+            <w:shd w:val="clear" w:color="auto" w:fill="F2F6FC"/>
+          </w:tcPr>
+          <w:p>
+            <w:r>
+              <w:rPr>
+                <w:sz w:val="18"/>
+              </w:rPr>
+              <w:t>标准已建立，待 Phase 8.1 首次使用 Layer 1 规则智能时验收</w:t>
+            </w:r>
+          </w:p>
+        </w:tc>
+        <w:tc>
+          <w:tcPr>
+            <w:tcW w:type="dxa" w:w="2160"/>
+            <w:shd w:val="clear" w:color="auto" w:fill="F2F6FC"/>
+          </w:tcPr>
+          <w:p>
+            <w:r>
+              <w:rPr>
+                <w:sz w:val="18"/>
+              </w:rPr>
+              <w:t>Phase 8.1</w:t>
+            </w:r>
+          </w:p>
+        </w:tc>
+      </w:tr>
+      <w:tr>
+        <w:tc>
+          <w:tcPr>
+            <w:tcW w:type="dxa" w:w="2160"/>
+          </w:tcPr>
+          <w:p>
+            <w:r>
+              <w:rPr>
+                <w:sz w:val="18"/>
+              </w:rPr>
+              <w:t>CF-2</w:t>
+            </w:r>
+          </w:p>
+        </w:tc>
+        <w:tc>
+          <w:tcPr>
+            <w:tcW w:type="dxa" w:w="2160"/>
+          </w:tcPr>
+          <w:p>
+            <w:r>
+              <w:rPr>
+                <w:sz w:val="18"/>
+              </w:rPr>
+              <w:t>知识库 / 模板库正向价值</w:t>
+            </w:r>
+          </w:p>
+        </w:tc>
+        <w:tc>
+          <w:tcPr>
+            <w:tcW w:type="dxa" w:w="2160"/>
+          </w:tcPr>
+          <w:p>
+            <w:r>
+              <w:rPr>
+                <w:sz w:val="18"/>
+              </w:rPr>
+              <w:t>已补充（3 文档），当前阶段 foundation placeholder</w:t>
+            </w:r>
+          </w:p>
+        </w:tc>
+        <w:tc>
+          <w:tcPr>
+            <w:tcW w:type="dxa" w:w="2160"/>
+          </w:tcPr>
+          <w:p>
+            <w:r>
+              <w:rPr>
+                <w:sz w:val="18"/>
+              </w:rPr>
+              <w:t>Phase 8.6</w:t>
             </w:r>
           </w:p>
         </w:tc>

</xml_diff>